<commit_message>
update md name in document templates
</commit_message>
<xml_diff>
--- a/document_templates/Contracts-deferral/company/contract_company.docx
+++ b/document_templates/Contracts-deferral/company/contract_company.docx
@@ -171,8 +171,22 @@
           <w:szCs w:val="24"/>
           <w:highlight w:val="none"/>
         </w:rPr>
-        <w:t>Monsieur Mélaine Marcel Séraphin DIGBE</w:t>
-      </w:r>
+        <w:t xml:space="preserve">Monsieur </w:t>
+      </w:r>
+      <w:r>
+        <w:rPr>
+          <w:rFonts w:hint="default" w:ascii="Times New Roman" w:hAnsi="Times New Roman" w:cs="Times New Roman"/>
+          <w:b/>
+          <w:bCs/>
+          <w:iCs/>
+          <w:sz w:val="24"/>
+          <w:szCs w:val="24"/>
+          <w:highlight w:val="none"/>
+        </w:rPr>
+        <w:t>Pascal KOVE</w:t>
+      </w:r>
+      <w:bookmarkStart w:id="10" w:name="_GoBack"/>
+      <w:bookmarkEnd w:id="10"/>
       <w:r>
         <w:rPr>
           <w:rFonts w:hint="default" w:ascii="Times New Roman" w:hAnsi="Times New Roman" w:cs="Times New Roman"/>
@@ -2724,8 +2738,6 @@
         </w:rPr>
         <w:t xml:space="preserve">. </w:t>
       </w:r>
-      <w:bookmarkStart w:id="10" w:name="_GoBack"/>
-      <w:bookmarkEnd w:id="10"/>
     </w:p>
     <w:p>
       <w:pPr>

</xml_diff>

<commit_message>
remove passasion date in contracts
</commit_message>
<xml_diff>
--- a/document_templates/Contracts-deferral/company/contract_company.docx
+++ b/document_templates/Contracts-deferral/company/contract_company.docx
@@ -147,6 +147,7 @@
           <w:sz w:val="24"/>
           <w:szCs w:val="24"/>
           <w:highlight w:val="none"/>
+          <w:lang w:val="en-US"/>
         </w:rPr>
       </w:pPr>
       <w:r>
@@ -185,8 +186,6 @@
         </w:rPr>
         <w:t>Pascal KOVE</w:t>
       </w:r>
-      <w:bookmarkStart w:id="10" w:name="_GoBack"/>
-      <w:bookmarkEnd w:id="10"/>
       <w:r>
         <w:rPr>
           <w:rFonts w:hint="default" w:ascii="Times New Roman" w:hAnsi="Times New Roman" w:cs="Times New Roman"/>
@@ -286,8 +285,23 @@
           <w:szCs w:val="24"/>
           <w:highlight w:val="none"/>
         </w:rPr>
-        <w:t>Me Afiavi S. do REGO-d’Almeida, Notaire à Lomé, en date du 19 Août 2022</w:t>
-      </w:r>
+        <w:t>Me Afiavi S. do REGO-d’Almeida, Notaire à Lomé</w:t>
+      </w:r>
+      <w:r>
+        <w:rPr>
+          <w:rFonts w:hint="default" w:ascii="Times New Roman" w:hAnsi="Times New Roman" w:cs="Times New Roman"/>
+          <w:bCs/>
+          <w:iCs/>
+          <w:color w:val="111111"/>
+          <w:sz w:val="24"/>
+          <w:szCs w:val="24"/>
+          <w:highlight w:val="none"/>
+          <w:lang w:val="en-US"/>
+        </w:rPr>
+        <w:t>,</w:t>
+      </w:r>
+      <w:bookmarkStart w:id="10" w:name="_GoBack"/>
+      <w:bookmarkEnd w:id="10"/>
     </w:p>
     <w:p>
       <w:pPr>

</xml_diff>

<commit_message>
add option for insurance
</commit_message>
<xml_diff>
--- a/document_templates/Contracts-deferral/company/contract_company.docx
+++ b/document_templates/Contracts-deferral/company/contract_company.docx
@@ -300,8 +300,6 @@
         </w:rPr>
         <w:t>,</w:t>
       </w:r>
-      <w:bookmarkStart w:id="10" w:name="_GoBack"/>
-      <w:bookmarkEnd w:id="10"/>
     </w:p>
     <w:p>
       <w:pPr>
@@ -2095,6 +2093,7 @@
           <w:b/>
           <w:sz w:val="24"/>
           <w:szCs w:val="24"/>
+          <w:lang w:val="en-US"/>
         </w:rPr>
       </w:pPr>
       <w:r>
@@ -2107,22 +2106,44 @@
         </w:rPr>
         <w:tab/>
       </w:r>
-      <w:r>
-        <w:rPr>
-          <w:rFonts w:hint="default" w:ascii="Times New Roman" w:hAnsi="Times New Roman" w:cs="Times New Roman"/>
-          <w:b/>
-          <w:sz w:val="24"/>
-          <w:szCs w:val="24"/>
-        </w:rPr>
-        <w:t>Prime d’assurance</w:t>
-      </w:r>
-      <w:r>
-        <w:rPr>
-          <w:rFonts w:hint="default" w:ascii="Times New Roman" w:hAnsi="Times New Roman" w:cs="Times New Roman"/>
-          <w:b/>
-          <w:sz w:val="24"/>
-          <w:szCs w:val="24"/>
-          <w:shd w:val="clear" w:fill="auto"/>
+      <w:bookmarkStart w:id="10" w:name="_GoBack"/>
+      <w:bookmarkEnd w:id="10"/>
+      <w:r>
+        <w:rPr>
+          <w:rFonts w:hint="default" w:ascii="Times New Roman" w:hAnsi="Times New Roman" w:cs="Times New Roman"/>
+          <w:b/>
+          <w:sz w:val="24"/>
+          <w:szCs w:val="24"/>
+          <w:lang w:val="en-US"/>
+        </w:rPr>
+        <w:t>${insurance}</w:t>
+      </w:r>
+    </w:p>
+    <w:p>
+      <w:pPr>
+        <w:tabs>
+          <w:tab w:val="left" w:pos="708"/>
+          <w:tab w:val="left" w:pos="1416"/>
+          <w:tab w:val="left" w:pos="2124"/>
+          <w:tab w:val="left" w:pos="2748"/>
+          <w:tab w:val="left" w:pos="3708"/>
+        </w:tabs>
+        <w:spacing w:line="240" w:lineRule="auto"/>
+        <w:jc w:val="both"/>
+        <w:rPr>
+          <w:rFonts w:hint="default" w:ascii="Times New Roman" w:hAnsi="Times New Roman" w:cs="Times New Roman"/>
+          <w:b/>
+          <w:sz w:val="24"/>
+          <w:szCs w:val="24"/>
+          <w:lang w:val="en-US"/>
+        </w:rPr>
+      </w:pPr>
+      <w:r>
+        <w:rPr>
+          <w:rFonts w:hint="default" w:ascii="Times New Roman" w:hAnsi="Times New Roman" w:cs="Times New Roman"/>
+          <w:b/>
+          <w:sz w:val="24"/>
+          <w:szCs w:val="24"/>
           <w:lang w:val="en-US"/>
         </w:rPr>
         <w:tab/>
@@ -2133,7 +2154,16 @@
           <w:b/>
           <w:sz w:val="24"/>
           <w:szCs w:val="24"/>
-          <w:shd w:val="clear" w:fill="auto"/>
+          <w:lang w:val="en-US"/>
+        </w:rPr>
+        <w:t xml:space="preserve">${key} </w:t>
+      </w:r>
+      <w:r>
+        <w:rPr>
+          <w:rFonts w:hint="default" w:ascii="Times New Roman" w:hAnsi="Times New Roman" w:cs="Times New Roman"/>
+          <w:b/>
+          <w:sz w:val="24"/>
+          <w:szCs w:val="24"/>
           <w:lang w:val="en-US"/>
         </w:rPr>
         <w:tab/>
@@ -2144,7 +2174,6 @@
           <w:b/>
           <w:sz w:val="24"/>
           <w:szCs w:val="24"/>
-          <w:shd w:val="clear" w:fill="auto"/>
           <w:lang w:val="en-US"/>
         </w:rPr>
         <w:tab/>
@@ -2155,27 +2184,58 @@
           <w:b/>
           <w:sz w:val="24"/>
           <w:szCs w:val="24"/>
-        </w:rPr>
-        <w:t xml:space="preserve">: </w:t>
-      </w:r>
-      <w:r>
-        <w:rPr>
-          <w:rFonts w:hint="default" w:ascii="Times New Roman" w:hAnsi="Times New Roman" w:cs="Times New Roman"/>
-          <w:b/>
-          <w:sz w:val="24"/>
-          <w:szCs w:val="24"/>
-          <w:lang w:val="en-US"/>
-        </w:rPr>
-        <w:t>S</w:t>
-      </w:r>
-      <w:r>
-        <w:rPr>
-          <w:rFonts w:hint="default" w:ascii="Times New Roman" w:hAnsi="Times New Roman" w:cs="Times New Roman"/>
-          <w:b/>
-          <w:sz w:val="24"/>
-          <w:szCs w:val="24"/>
-        </w:rPr>
-        <w:t>elon la grille de l’assureur</w:t>
+          <w:lang w:val="en-US"/>
+        </w:rPr>
+        <w:tab/>
+      </w:r>
+      <w:r>
+        <w:rPr>
+          <w:rFonts w:hint="default" w:ascii="Times New Roman" w:hAnsi="Times New Roman" w:cs="Times New Roman"/>
+          <w:b/>
+          <w:sz w:val="24"/>
+          <w:szCs w:val="24"/>
+          <w:lang w:val="en-US"/>
+        </w:rPr>
+        <w:t>:  ${value}</w:t>
+      </w:r>
+    </w:p>
+    <w:p>
+      <w:pPr>
+        <w:tabs>
+          <w:tab w:val="left" w:pos="708"/>
+          <w:tab w:val="left" w:pos="1416"/>
+          <w:tab w:val="left" w:pos="2124"/>
+          <w:tab w:val="left" w:pos="2748"/>
+          <w:tab w:val="left" w:pos="3708"/>
+        </w:tabs>
+        <w:spacing w:line="240" w:lineRule="auto"/>
+        <w:jc w:val="both"/>
+        <w:rPr>
+          <w:rFonts w:hint="default" w:ascii="Times New Roman" w:hAnsi="Times New Roman" w:cs="Times New Roman"/>
+          <w:b/>
+          <w:sz w:val="24"/>
+          <w:szCs w:val="24"/>
+        </w:rPr>
+      </w:pPr>
+      <w:r>
+        <w:rPr>
+          <w:rFonts w:hint="default" w:ascii="Times New Roman" w:hAnsi="Times New Roman" w:cs="Times New Roman"/>
+          <w:b/>
+          <w:sz w:val="24"/>
+          <w:szCs w:val="24"/>
+          <w:lang w:val="en-US"/>
+        </w:rPr>
+        <w:tab/>
+      </w:r>
+      <w:r>
+        <w:rPr>
+          <w:rFonts w:hint="default" w:ascii="Times New Roman" w:hAnsi="Times New Roman" w:cs="Times New Roman"/>
+          <w:b/>
+          <w:sz w:val="24"/>
+          <w:szCs w:val="24"/>
+          <w:lang w:val="en-US"/>
+        </w:rPr>
+        <w:t>${/insurance}</w:t>
       </w:r>
     </w:p>
     <w:p>

</xml_diff>

<commit_message>
update documents for review_bonus and risk_premium_percentage new integration
</commit_message>
<xml_diff>
--- a/document_templates/Contracts-deferral/company/contract_company.docx
+++ b/document_templates/Contracts-deferral/company/contract_company.docx
@@ -7,7 +7,7 @@
         <w:spacing w:line="240" w:lineRule="auto"/>
         <w:jc w:val="center"/>
         <w:rPr>
-          <w:rFonts w:ascii="Times New Roman" w:hAnsi="Times New Roman"/>
+          <w:rFonts w:hint="default" w:ascii="Times New Roman" w:hAnsi="Times New Roman" w:cs="Times New Roman"/>
           <w:b/>
           <w:sz w:val="28"/>
           <w:szCs w:val="28"/>
@@ -16,7 +16,7 @@
       </w:pPr>
       <w:r>
         <w:rPr>
-          <w:rFonts w:ascii="Times New Roman" w:hAnsi="Times New Roman"/>
+          <w:rFonts w:hint="default" w:ascii="Times New Roman" w:hAnsi="Times New Roman" w:cs="Times New Roman"/>
           <w:b/>
           <w:sz w:val="28"/>
           <w:szCs w:val="28"/>
@@ -2106,8 +2106,6 @@
         </w:rPr>
         <w:tab/>
       </w:r>
-      <w:bookmarkStart w:id="10" w:name="_GoBack"/>
-      <w:bookmarkEnd w:id="10"/>
       <w:r>
         <w:rPr>
           <w:rFonts w:hint="default" w:ascii="Times New Roman" w:hAnsi="Times New Roman" w:cs="Times New Roman"/>
@@ -2156,47 +2154,7 @@
           <w:szCs w:val="24"/>
           <w:lang w:val="en-US"/>
         </w:rPr>
-        <w:t xml:space="preserve">${key} </w:t>
-      </w:r>
-      <w:r>
-        <w:rPr>
-          <w:rFonts w:hint="default" w:ascii="Times New Roman" w:hAnsi="Times New Roman" w:cs="Times New Roman"/>
-          <w:b/>
-          <w:sz w:val="24"/>
-          <w:szCs w:val="24"/>
-          <w:lang w:val="en-US"/>
-        </w:rPr>
-        <w:tab/>
-      </w:r>
-      <w:r>
-        <w:rPr>
-          <w:rFonts w:hint="default" w:ascii="Times New Roman" w:hAnsi="Times New Roman" w:cs="Times New Roman"/>
-          <w:b/>
-          <w:sz w:val="24"/>
-          <w:szCs w:val="24"/>
-          <w:lang w:val="en-US"/>
-        </w:rPr>
-        <w:tab/>
-      </w:r>
-      <w:r>
-        <w:rPr>
-          <w:rFonts w:hint="default" w:ascii="Times New Roman" w:hAnsi="Times New Roman" w:cs="Times New Roman"/>
-          <w:b/>
-          <w:sz w:val="24"/>
-          <w:szCs w:val="24"/>
-          <w:lang w:val="en-US"/>
-        </w:rPr>
-        <w:tab/>
-      </w:r>
-      <w:r>
-        <w:rPr>
-          <w:rFonts w:hint="default" w:ascii="Times New Roman" w:hAnsi="Times New Roman" w:cs="Times New Roman"/>
-          <w:b/>
-          <w:sz w:val="24"/>
-          <w:szCs w:val="24"/>
-          <w:lang w:val="en-US"/>
-        </w:rPr>
-        <w:t>:  ${value}</w:t>
+        <w:t>${insurance}</w:t>
       </w:r>
     </w:p>
     <w:p>
@@ -2215,6 +2173,7 @@
           <w:b/>
           <w:sz w:val="24"/>
           <w:szCs w:val="24"/>
+          <w:lang w:val="en-US"/>
         </w:rPr>
       </w:pPr>
       <w:r>
@@ -2235,7 +2194,47 @@
           <w:szCs w:val="24"/>
           <w:lang w:val="en-US"/>
         </w:rPr>
-        <w:t>${/insurance}</w:t>
+        <w:t xml:space="preserve">${key} </w:t>
+      </w:r>
+      <w:r>
+        <w:rPr>
+          <w:rFonts w:hint="default" w:ascii="Times New Roman" w:hAnsi="Times New Roman" w:cs="Times New Roman"/>
+          <w:b/>
+          <w:sz w:val="24"/>
+          <w:szCs w:val="24"/>
+          <w:lang w:val="en-US"/>
+        </w:rPr>
+        <w:tab/>
+      </w:r>
+      <w:r>
+        <w:rPr>
+          <w:rFonts w:hint="default" w:ascii="Times New Roman" w:hAnsi="Times New Roman" w:cs="Times New Roman"/>
+          <w:b/>
+          <w:sz w:val="24"/>
+          <w:szCs w:val="24"/>
+          <w:lang w:val="en-US"/>
+        </w:rPr>
+        <w:tab/>
+      </w:r>
+      <w:r>
+        <w:rPr>
+          <w:rFonts w:hint="default" w:ascii="Times New Roman" w:hAnsi="Times New Roman" w:cs="Times New Roman"/>
+          <w:b/>
+          <w:sz w:val="24"/>
+          <w:szCs w:val="24"/>
+          <w:lang w:val="en-US"/>
+        </w:rPr>
+        <w:tab/>
+      </w:r>
+      <w:r>
+        <w:rPr>
+          <w:rFonts w:hint="default" w:ascii="Times New Roman" w:hAnsi="Times New Roman" w:cs="Times New Roman"/>
+          <w:b/>
+          <w:sz w:val="24"/>
+          <w:szCs w:val="24"/>
+          <w:lang w:val="en-US"/>
+        </w:rPr>
+        <w:t>: ${value}</w:t>
       </w:r>
     </w:p>
     <w:p>
@@ -2248,12 +2247,12 @@
           <w:tab w:val="left" w:pos="3708"/>
         </w:tabs>
         <w:spacing w:line="240" w:lineRule="auto"/>
-        <w:jc w:val="both"/>
-        <w:rPr>
-          <w:rFonts w:hint="default" w:ascii="Times New Roman" w:hAnsi="Times New Roman" w:cs="Times New Roman"/>
-          <w:b/>
-          <w:sz w:val="24"/>
-          <w:szCs w:val="24"/>
+        <w:rPr>
+          <w:rFonts w:hint="default" w:ascii="Times New Roman" w:hAnsi="Times New Roman" w:cs="Times New Roman"/>
+          <w:b/>
+          <w:sz w:val="24"/>
+          <w:szCs w:val="24"/>
+          <w:shd w:val="clear" w:fill="auto"/>
           <w:lang w:val="en-US"/>
         </w:rPr>
       </w:pPr>
@@ -2275,37 +2274,7 @@
           <w:szCs w:val="24"/>
           <w:lang w:val="en-US"/>
         </w:rPr>
-        <w:t>${line_risk_premium_percentage}</w:t>
-      </w:r>
-      <w:r>
-        <w:rPr>
-          <w:rFonts w:hint="default" w:ascii="Times New Roman" w:hAnsi="Times New Roman" w:cs="Times New Roman"/>
-          <w:b/>
-          <w:sz w:val="24"/>
-          <w:szCs w:val="24"/>
-          <w:lang w:val="en-US"/>
-        </w:rPr>
-        <w:tab/>
-      </w:r>
-      <w:r>
-        <w:rPr>
-          <w:rFonts w:hint="default" w:ascii="Times New Roman" w:hAnsi="Times New Roman" w:cs="Times New Roman"/>
-          <w:b/>
-          <w:sz w:val="24"/>
-          <w:szCs w:val="24"/>
-          <w:lang w:val="en-US"/>
-        </w:rPr>
-        <w:tab/>
-      </w:r>
-      <w:r>
-        <w:rPr>
-          <w:rFonts w:hint="default" w:ascii="Times New Roman" w:hAnsi="Times New Roman" w:cs="Times New Roman"/>
-          <w:b/>
-          <w:sz w:val="24"/>
-          <w:szCs w:val="24"/>
-          <w:lang w:val="en-US"/>
-        </w:rPr>
-        <w:t>: ${line_risk_premium_percentage_value}</w:t>
+        <w:t>${/insurance}</w:t>
       </w:r>
     </w:p>
     <w:p>
@@ -2324,7 +2293,6 @@
           <w:b/>
           <w:sz w:val="24"/>
           <w:szCs w:val="24"/>
-          <w:highlight w:val="none"/>
           <w:lang w:val="en-US"/>
         </w:rPr>
       </w:pPr>
@@ -2344,18 +2312,36 @@
           <w:b/>
           <w:sz w:val="24"/>
           <w:szCs w:val="24"/>
-          <w:shd w:val="clear" w:fill="auto"/>
-          <w:lang w:val="en-US"/>
-        </w:rPr>
-        <w:t>${line_review_bonus}</w:t>
-      </w:r>
-      <w:r>
-        <w:rPr>
-          <w:rFonts w:hint="default" w:ascii="Times New Roman" w:hAnsi="Times New Roman" w:cs="Times New Roman"/>
-          <w:b/>
-          <w:sz w:val="24"/>
-          <w:szCs w:val="24"/>
-          <w:shd w:val="clear" w:fill="auto"/>
+          <w:lang w:val="en-US"/>
+        </w:rPr>
+        <w:t>${riskPremiumPercentage}</w:t>
+      </w:r>
+    </w:p>
+    <w:p>
+      <w:pPr>
+        <w:tabs>
+          <w:tab w:val="left" w:pos="708"/>
+          <w:tab w:val="left" w:pos="1416"/>
+          <w:tab w:val="left" w:pos="2124"/>
+          <w:tab w:val="left" w:pos="2748"/>
+          <w:tab w:val="left" w:pos="3708"/>
+        </w:tabs>
+        <w:spacing w:line="240" w:lineRule="auto"/>
+        <w:jc w:val="both"/>
+        <w:rPr>
+          <w:rFonts w:hint="default" w:ascii="Times New Roman" w:hAnsi="Times New Roman" w:cs="Times New Roman"/>
+          <w:b/>
+          <w:sz w:val="24"/>
+          <w:szCs w:val="24"/>
+          <w:lang w:val="en-US"/>
+        </w:rPr>
+      </w:pPr>
+      <w:r>
+        <w:rPr>
+          <w:rFonts w:hint="default" w:ascii="Times New Roman" w:hAnsi="Times New Roman" w:cs="Times New Roman"/>
+          <w:b/>
+          <w:sz w:val="24"/>
+          <w:szCs w:val="24"/>
           <w:lang w:val="en-US"/>
         </w:rPr>
         <w:tab/>
@@ -2366,7 +2352,16 @@
           <w:b/>
           <w:sz w:val="24"/>
           <w:szCs w:val="24"/>
-          <w:shd w:val="clear" w:fill="auto"/>
+          <w:lang w:val="en-US"/>
+        </w:rPr>
+        <w:t xml:space="preserve">${key} </w:t>
+      </w:r>
+      <w:r>
+        <w:rPr>
+          <w:rFonts w:hint="default" w:ascii="Times New Roman" w:hAnsi="Times New Roman" w:cs="Times New Roman"/>
+          <w:b/>
+          <w:sz w:val="24"/>
+          <w:szCs w:val="24"/>
           <w:lang w:val="en-US"/>
         </w:rPr>
         <w:tab/>
@@ -2377,10 +2372,219 @@
           <w:b/>
           <w:sz w:val="24"/>
           <w:szCs w:val="24"/>
-          <w:shd w:val="clear" w:fill="auto"/>
-          <w:lang w:val="en-US"/>
-        </w:rPr>
-        <w:t>${line_review_bonus_value}</w:t>
+          <w:lang w:val="en-US"/>
+        </w:rPr>
+        <w:tab/>
+      </w:r>
+      <w:r>
+        <w:rPr>
+          <w:rFonts w:hint="default" w:ascii="Times New Roman" w:hAnsi="Times New Roman" w:cs="Times New Roman"/>
+          <w:b/>
+          <w:sz w:val="24"/>
+          <w:szCs w:val="24"/>
+          <w:lang w:val="en-US"/>
+        </w:rPr>
+        <w:t>: ${value}</w:t>
+      </w:r>
+    </w:p>
+    <w:p>
+      <w:pPr>
+        <w:tabs>
+          <w:tab w:val="left" w:pos="708"/>
+          <w:tab w:val="left" w:pos="1416"/>
+          <w:tab w:val="left" w:pos="2124"/>
+          <w:tab w:val="left" w:pos="2748"/>
+          <w:tab w:val="left" w:pos="3708"/>
+        </w:tabs>
+        <w:spacing w:line="240" w:lineRule="auto"/>
+        <w:rPr>
+          <w:rFonts w:hint="default" w:ascii="Times New Roman" w:hAnsi="Times New Roman" w:cs="Times New Roman"/>
+          <w:b/>
+          <w:sz w:val="24"/>
+          <w:szCs w:val="24"/>
+          <w:lang w:val="en-US"/>
+        </w:rPr>
+      </w:pPr>
+      <w:r>
+        <w:rPr>
+          <w:rFonts w:hint="default" w:ascii="Times New Roman" w:hAnsi="Times New Roman" w:cs="Times New Roman"/>
+          <w:b/>
+          <w:sz w:val="24"/>
+          <w:szCs w:val="24"/>
+          <w:lang w:val="en-US"/>
+        </w:rPr>
+        <w:tab/>
+      </w:r>
+      <w:r>
+        <w:rPr>
+          <w:rFonts w:hint="default" w:ascii="Times New Roman" w:hAnsi="Times New Roman" w:cs="Times New Roman"/>
+          <w:b/>
+          <w:sz w:val="24"/>
+          <w:szCs w:val="24"/>
+          <w:lang w:val="en-US"/>
+        </w:rPr>
+        <w:t>${/riskPremiumPercentage}</w:t>
+      </w:r>
+    </w:p>
+    <w:p>
+      <w:pPr>
+        <w:tabs>
+          <w:tab w:val="left" w:pos="708"/>
+          <w:tab w:val="left" w:pos="1416"/>
+          <w:tab w:val="left" w:pos="2124"/>
+          <w:tab w:val="left" w:pos="2748"/>
+          <w:tab w:val="left" w:pos="3708"/>
+        </w:tabs>
+        <w:spacing w:line="240" w:lineRule="auto"/>
+        <w:jc w:val="both"/>
+        <w:rPr>
+          <w:rFonts w:hint="default" w:ascii="Times New Roman" w:hAnsi="Times New Roman" w:cs="Times New Roman"/>
+          <w:b/>
+          <w:sz w:val="24"/>
+          <w:szCs w:val="24"/>
+          <w:lang w:val="en-US"/>
+        </w:rPr>
+      </w:pPr>
+      <w:r>
+        <w:rPr>
+          <w:rFonts w:hint="default" w:ascii="Times New Roman" w:hAnsi="Times New Roman" w:cs="Times New Roman"/>
+          <w:b/>
+          <w:sz w:val="24"/>
+          <w:szCs w:val="24"/>
+          <w:lang w:val="en-US"/>
+        </w:rPr>
+        <w:tab/>
+      </w:r>
+      <w:r>
+        <w:rPr>
+          <w:rFonts w:hint="default" w:ascii="Times New Roman" w:hAnsi="Times New Roman" w:cs="Times New Roman"/>
+          <w:b/>
+          <w:sz w:val="24"/>
+          <w:szCs w:val="24"/>
+          <w:lang w:val="en-US"/>
+        </w:rPr>
+        <w:t>${reviewBonus}</w:t>
+      </w:r>
+    </w:p>
+    <w:p>
+      <w:pPr>
+        <w:tabs>
+          <w:tab w:val="left" w:pos="708"/>
+          <w:tab w:val="left" w:pos="1416"/>
+          <w:tab w:val="left" w:pos="2124"/>
+          <w:tab w:val="left" w:pos="2748"/>
+          <w:tab w:val="left" w:pos="3708"/>
+        </w:tabs>
+        <w:spacing w:line="240" w:lineRule="auto"/>
+        <w:jc w:val="both"/>
+        <w:rPr>
+          <w:rFonts w:hint="default" w:ascii="Times New Roman" w:hAnsi="Times New Roman" w:cs="Times New Roman"/>
+          <w:b/>
+          <w:sz w:val="24"/>
+          <w:szCs w:val="24"/>
+          <w:lang w:val="en-US"/>
+        </w:rPr>
+      </w:pPr>
+      <w:r>
+        <w:rPr>
+          <w:rFonts w:hint="default" w:ascii="Times New Roman" w:hAnsi="Times New Roman" w:cs="Times New Roman"/>
+          <w:b/>
+          <w:sz w:val="24"/>
+          <w:szCs w:val="24"/>
+          <w:lang w:val="en-US"/>
+        </w:rPr>
+        <w:tab/>
+      </w:r>
+      <w:r>
+        <w:rPr>
+          <w:rFonts w:hint="default" w:ascii="Times New Roman" w:hAnsi="Times New Roman" w:cs="Times New Roman"/>
+          <w:b/>
+          <w:sz w:val="24"/>
+          <w:szCs w:val="24"/>
+          <w:lang w:val="en-US"/>
+        </w:rPr>
+        <w:t xml:space="preserve">${key} </w:t>
+      </w:r>
+      <w:r>
+        <w:rPr>
+          <w:rFonts w:hint="default" w:ascii="Times New Roman" w:hAnsi="Times New Roman" w:cs="Times New Roman"/>
+          <w:b/>
+          <w:sz w:val="24"/>
+          <w:szCs w:val="24"/>
+          <w:lang w:val="en-US"/>
+        </w:rPr>
+        <w:tab/>
+      </w:r>
+      <w:r>
+        <w:rPr>
+          <w:rFonts w:hint="default" w:ascii="Times New Roman" w:hAnsi="Times New Roman" w:cs="Times New Roman"/>
+          <w:b/>
+          <w:sz w:val="24"/>
+          <w:szCs w:val="24"/>
+          <w:lang w:val="en-US"/>
+        </w:rPr>
+        <w:tab/>
+      </w:r>
+      <w:r>
+        <w:rPr>
+          <w:rFonts w:hint="default" w:ascii="Times New Roman" w:hAnsi="Times New Roman" w:cs="Times New Roman"/>
+          <w:b/>
+          <w:sz w:val="24"/>
+          <w:szCs w:val="24"/>
+          <w:lang w:val="en-US"/>
+        </w:rPr>
+        <w:t xml:space="preserve">: </w:t>
+      </w:r>
+      <w:bookmarkStart w:id="10" w:name="_GoBack"/>
+      <w:bookmarkEnd w:id="10"/>
+      <w:r>
+        <w:rPr>
+          <w:rFonts w:hint="default" w:ascii="Times New Roman" w:hAnsi="Times New Roman" w:cs="Times New Roman"/>
+          <w:b/>
+          <w:sz w:val="24"/>
+          <w:szCs w:val="24"/>
+          <w:lang w:val="en-US"/>
+        </w:rPr>
+        <w:t>${value}</w:t>
+      </w:r>
+    </w:p>
+    <w:p>
+      <w:pPr>
+        <w:tabs>
+          <w:tab w:val="left" w:pos="708"/>
+          <w:tab w:val="left" w:pos="1416"/>
+          <w:tab w:val="left" w:pos="2124"/>
+          <w:tab w:val="left" w:pos="2748"/>
+          <w:tab w:val="left" w:pos="3708"/>
+        </w:tabs>
+        <w:spacing w:line="240" w:lineRule="auto"/>
+        <w:rPr>
+          <w:rFonts w:hint="default" w:ascii="Times New Roman" w:hAnsi="Times New Roman" w:cs="Times New Roman"/>
+          <w:b/>
+          <w:sz w:val="24"/>
+          <w:szCs w:val="24"/>
+          <w:lang w:val="en-US"/>
+        </w:rPr>
+      </w:pPr>
+      <w:r>
+        <w:rPr>
+          <w:rFonts w:hint="default" w:ascii="Times New Roman" w:hAnsi="Times New Roman" w:cs="Times New Roman"/>
+          <w:b/>
+          <w:sz w:val="24"/>
+          <w:szCs w:val="24"/>
+          <w:lang w:val="en-US"/>
+        </w:rPr>
+        <w:tab/>
+      </w:r>
+      <w:r>
+        <w:rPr>
+          <w:rFonts w:hint="default" w:ascii="Times New Roman" w:hAnsi="Times New Roman" w:cs="Times New Roman"/>
+          <w:b/>
+          <w:sz w:val="24"/>
+          <w:szCs w:val="24"/>
+          <w:lang w:val="en-US"/>
+        </w:rPr>
+        <w:t>${/reviewBonus}</w:t>
       </w:r>
     </w:p>
     <w:p>

</xml_diff>